<commit_message>
Add scholarship/aid investment share to the expanded analysis
Confirmed against the raw federal EADA data dictionary that athletically
related student aid is never reported broken out by individual sport
(unlike revenue/expense/participants, which are) -- so this is a real
school-level control, matching the original 30-school project's own
variable and construction, not a per-sport one.

Real finding: aid share is a significant positive predictor of GSR overall
(p=0.009), and specifically in football (p=0.029) -- where adding it makes
football's earlier standalone revenue-GSR effect (p=0.004) stop being
significant (p=0.328). The original project's core insight (it's aid
reinvestment, not raw revenue, that predicts outcomes) replicates and
sharpens at this larger scale. README and interview packet updated to
lead with this finding.

Co-Authored-By: Claude Sonnet 5 <noreply@anthropic.com>
Claude-Session: https://claude.ai/code/session_01RcE2exnnrfvRQANg1xodH9
</commit_message>
<xml_diff>
--- a/expanded/packet/NCAA_Expanded_Analysis_Packet.docx
+++ b/expanded/packet/NCAA_Expanded_Analysis_Packet.docx
@@ -890,14 +890,14 @@
           <w:sz w:val="20"/>
           <w:szCs w:val="20"/>
         </w:rPr>
-        <w:t xml:space="preserve">Football revenue predicts lower graduation rates. </w:t>
-      </w:r>
-      <w:r>
-        <w:rPr>
-          <w:sz w:val="20"/>
-          <w:szCs w:val="20"/>
-        </w:rPr>
-        <w:t xml:space="preserve">Controlling for nothing else, more football revenue significantly predicts a LOWER Graduation Success Rate (coefficient -2.67, p = 0.004), the opposite direction from "more resources helps academics," and a different story from the original 30-school project's finding that it's scholarship-investment share, not raw revenue, that drives outcomes.</w:t>
+        <w:t xml:space="preserve">Scholarship reinvestment explains football's revenue effect. </w:t>
+      </w:r>
+      <w:r>
+        <w:rPr>
+          <w:sz w:val="20"/>
+          <w:szCs w:val="20"/>
+        </w:rPr>
+        <w:t xml:space="preserve">On its own, more football revenue significantly predicts a LOWER Graduation Success Rate (p = 0.004). But once scholarship/aid investment share is added to the model, that revenue effect stops being significant (p = 0.328), while aid share itself becomes a significant positive predictor (p = 0.029). It isn't that football money hurts academics; it's that big-revenue programs that don't reinvest proportionally in aid have worse outcomes, replicating the original 30-school project's core finding at this larger scale, and pinpointing it specifically to football.</w:t>
       </w:r>
     </w:p>
     <w:p>
@@ -1113,6 +1113,23 @@
           <w:sz w:val="20"/>
           <w:szCs w:val="20"/>
         </w:rPr>
+        <w:t xml:space="preserve">Pulled institution-level scholarship/aid investment share from a separate EADA data category after confirming, against the raw federal data dictionary, that aid is never reported broken out by individual sport the way revenue and expenses are.</w:t>
+      </w:r>
+    </w:p>
+    <w:p>
+      <w:pPr>
+        <w:pStyle w:val="ListParagraph"/>
+        <w:numPr>
+          <w:ilvl w:val="0"/>
+          <w:numId w:val="3"/>
+        </w:numPr>
+        <w:spacing w:after="70" w:line="252"/>
+      </w:pPr>
+      <w:r>
+        <w:rPr>
+          <w:sz w:val="20"/>
+          <w:szCs w:val="20"/>
+        </w:rPr>
         <w:t xml:space="preserve">Merged all sources into one school-sport panel and ran the regression models in Python (pandas, statsmodels, robust standard errors).</w:t>
       </w:r>
     </w:p>
@@ -1211,7 +1228,7 @@
           <w:sz w:val="20"/>
           <w:szCs w:val="20"/>
         </w:rPr>
-        <w:t xml:space="preserve">Lead with the sport-specific split, not the pooled average: "more money = more wins" is real in basketball and volleyball but weak in football, and football revenue actually predicts worse academic outcomes. Be upfront that the NIL variable is a real but partial proxy (national top-100 presence), not verified spend; nobody publishes that.</w:t>
+        <w:t xml:space="preserve">Lead with the scholarship-share finding, it's the strongest story: revenue alone looks like it hurts football academics, but that's really scholarship reinvestment doing the work, the same mechanism the original 30-school project found, now pinpointed to one sport. Keep the sport-specific win% split as the second beat. Be upfront that the NIL variable is a real but partial proxy (national top-100 presence), not verified spend; nobody publishes that.</w:t>
       </w:r>
     </w:p>
     <w:sectPr>

</xml_diff>

<commit_message>
Fix two mis-cited p-values, add packet charts, and add interactive artifact companion
Corrected football and soccer win% p-values in README and packet (was
citing the model's overall F-test p-value instead of each coefficient's
own p-value: football 0.075->0.071, soccer 0.554->0.537). Added two
embedded charts to the docx/pdf packet. Added a standalone interactive
HTML companion (artifact_ncaa_explorer.html) with filterable scatter
charts and a sortable/searchable table of all 83 schools.

Co-Authored-By: Claude Sonnet 5 <noreply@anthropic.com>
Claude-Session: https://claude.ai/code/session_01RcE2exnnrfvRQANg1xodH9
</commit_message>
<xml_diff>
--- a/expanded/packet/NCAA_Expanded_Analysis_Packet.docx
+++ b/expanded/packet/NCAA_Expanded_Analysis_Packet.docx
@@ -38,6 +38,196 @@
           <w:szCs w:val="19"/>
         </w:rPr>
         <w:t xml:space="preserve">github.com/kellerzachary117/ncaa-revenue-analysis</w:t>
+      </w:r>
+    </w:p>
+    <w:tbl>
+      <w:tblPr>
+        <w:tblW w:type="dxa" w:w="10800"/>
+        <w:tblBorders>
+          <w:top w:val="none"/>
+          <w:left w:val="none"/>
+          <w:bottom w:val="none"/>
+          <w:right w:val="none"/>
+          <w:insideH w:val="none"/>
+          <w:insideV w:val="none"/>
+        </w:tblBorders>
+      </w:tblPr>
+      <w:tblGrid>
+        <w:gridCol w:w="2700"/>
+        <w:gridCol w:w="2700"/>
+        <w:gridCol w:w="2700"/>
+        <w:gridCol w:w="2700"/>
+      </w:tblGrid>
+      <w:tr>
+        <w:tc>
+          <w:tcPr>
+            <w:tcW w:type="dxa" w:w="2700"/>
+            <w:tcMar>
+              <w:top w:type="dxa" w:w="100"/>
+              <w:left w:type="dxa" w:w="80"/>
+              <w:bottom w:type="dxa" w:w="100"/>
+              <w:right w:type="dxa" w:w="80"/>
+            </w:tcMar>
+          </w:tcPr>
+          <w:p>
+            <w:pPr>
+              <w:spacing w:after="20"/>
+              <w:jc w:val="center"/>
+            </w:pPr>
+            <w:r>
+              <w:rPr>
+                <w:b/>
+                <w:bCs/>
+                <w:color w:val="1F3864"/>
+                <w:sz w:val="30"/>
+                <w:szCs w:val="30"/>
+              </w:rPr>
+              <w:t xml:space="preserve">83</w:t>
+            </w:r>
+          </w:p>
+          <w:p>
+            <w:pPr>
+              <w:jc w:val="center"/>
+            </w:pPr>
+            <w:r>
+              <w:rPr>
+                <w:color w:val="595959"/>
+                <w:sz w:val="15"/>
+                <w:szCs w:val="15"/>
+              </w:rPr>
+              <w:t xml:space="preserve">schools analyzed</w:t>
+            </w:r>
+          </w:p>
+        </w:tc>
+        <w:tc>
+          <w:tcPr>
+            <w:tcW w:type="dxa" w:w="2700"/>
+            <w:tcMar>
+              <w:top w:type="dxa" w:w="100"/>
+              <w:left w:type="dxa" w:w="80"/>
+              <w:bottom w:type="dxa" w:w="100"/>
+              <w:right w:type="dxa" w:w="80"/>
+            </w:tcMar>
+          </w:tcPr>
+          <w:p>
+            <w:pPr>
+              <w:spacing w:after="20"/>
+              <w:jc w:val="center"/>
+            </w:pPr>
+            <w:r>
+              <w:rPr>
+                <w:b/>
+                <w:bCs/>
+                <w:color w:val="1F3864"/>
+                <w:sz w:val="30"/>
+                <w:szCs w:val="30"/>
+              </w:rPr>
+              <w:t xml:space="preserve">4</w:t>
+            </w:r>
+          </w:p>
+          <w:p>
+            <w:pPr>
+              <w:jc w:val="center"/>
+            </w:pPr>
+            <w:r>
+              <w:rPr>
+                <w:color w:val="595959"/>
+                <w:sz w:val="15"/>
+                <w:szCs w:val="15"/>
+              </w:rPr>
+              <w:t xml:space="preserve">sports</w:t>
+            </w:r>
+          </w:p>
+        </w:tc>
+        <w:tc>
+          <w:tcPr>
+            <w:tcW w:type="dxa" w:w="2700"/>
+            <w:tcMar>
+              <w:top w:type="dxa" w:w="100"/>
+              <w:left w:type="dxa" w:w="80"/>
+              <w:bottom w:type="dxa" w:w="100"/>
+              <w:right w:type="dxa" w:w="80"/>
+            </w:tcMar>
+          </w:tcPr>
+          <w:p>
+            <w:pPr>
+              <w:spacing w:after="20"/>
+              <w:jc w:val="center"/>
+            </w:pPr>
+            <w:r>
+              <w:rPr>
+                <w:b/>
+                <w:bCs/>
+                <w:color w:val="1F3864"/>
+                <w:sz w:val="30"/>
+                <w:szCs w:val="30"/>
+              </w:rPr>
+              <w:t xml:space="preserve">249</w:t>
+            </w:r>
+          </w:p>
+          <w:p>
+            <w:pPr>
+              <w:jc w:val="center"/>
+            </w:pPr>
+            <w:r>
+              <w:rPr>
+                <w:color w:val="595959"/>
+                <w:sz w:val="15"/>
+                <w:szCs w:val="15"/>
+              </w:rPr>
+              <w:t xml:space="preserve">school-sport rows</w:t>
+            </w:r>
+          </w:p>
+        </w:tc>
+        <w:tc>
+          <w:tcPr>
+            <w:tcW w:type="dxa" w:w="2700"/>
+            <w:tcMar>
+              <w:top w:type="dxa" w:w="100"/>
+              <w:left w:type="dxa" w:w="80"/>
+              <w:bottom w:type="dxa" w:w="100"/>
+              <w:right w:type="dxa" w:w="80"/>
+            </w:tcMar>
+          </w:tcPr>
+          <w:p>
+            <w:pPr>
+              <w:spacing w:after="20"/>
+              <w:jc w:val="center"/>
+            </w:pPr>
+            <w:r>
+              <w:rPr>
+                <w:b/>
+                <w:bCs/>
+                <w:color w:val="1F3864"/>
+                <w:sz w:val="30"/>
+                <w:szCs w:val="30"/>
+              </w:rPr>
+              <w:t xml:space="preserve">p=0.009</w:t>
+            </w:r>
+          </w:p>
+          <w:p>
+            <w:pPr>
+              <w:jc w:val="center"/>
+            </w:pPr>
+            <w:r>
+              <w:rPr>
+                <w:color w:val="595959"/>
+                <w:sz w:val="15"/>
+                <w:szCs w:val="15"/>
+              </w:rPr>
+              <w:t xml:space="preserve">aid share predicts GSR</w:t>
+            </w:r>
+          </w:p>
+        </w:tc>
+      </w:tr>
+    </w:tbl>
+    <w:p>
+      <w:pPr>
+        <w:spacing w:after="20"/>
+      </w:pPr>
+      <w:r>
+        <w:br/>
+        <w:t xml:space="preserve"/>
       </w:r>
     </w:p>
     <w:p>
@@ -857,6 +1047,607 @@
     </w:p>
     <w:p>
       <w:pPr>
+        <w:pStyle w:val="Heading2"/>
+        <w:spacing w:after="80" w:before="160"/>
+      </w:pPr>
+      <w:r>
+        <w:rPr>
+          <w:b/>
+          <w:bCs/>
+          <w:color w:val="1F3864"/>
+          <w:sz w:val="21"/>
+          <w:szCs w:val="21"/>
+        </w:rPr>
+        <w:t xml:space="preserve">By the Numbers</w:t>
+      </w:r>
+    </w:p>
+    <w:tbl>
+      <w:tblPr>
+        <w:tblW w:type="dxa" w:w="10800"/>
+        <w:tblBorders>
+          <w:top w:val="single" w:color="auto" w:sz="4"/>
+          <w:left w:val="single" w:color="auto" w:sz="4"/>
+          <w:bottom w:val="single" w:color="auto" w:sz="4"/>
+          <w:right w:val="single" w:color="auto" w:sz="4"/>
+          <w:insideH w:val="single" w:color="auto" w:sz="4"/>
+          <w:insideV w:val="single" w:color="auto" w:sz="4"/>
+        </w:tblBorders>
+      </w:tblPr>
+      <w:tblGrid>
+        <w:gridCol w:w="2700"/>
+        <w:gridCol w:w="2700"/>
+        <w:gridCol w:w="2700"/>
+        <w:gridCol w:w="2700"/>
+      </w:tblGrid>
+      <w:tr>
+        <w:trPr>
+          <w:tblHeader/>
+        </w:trPr>
+        <w:tc>
+          <w:tcPr>
+            <w:tcW w:type="dxa" w:w="2160"/>
+            <w:shd w:fill="1F3864" w:val="clear"/>
+            <w:tcMar>
+              <w:top w:type="dxa" w:w="40"/>
+              <w:left w:type="dxa" w:w="100"/>
+              <w:bottom w:type="dxa" w:w="40"/>
+              <w:right w:type="dxa" w:w="100"/>
+            </w:tcMar>
+          </w:tcPr>
+          <w:p>
+            <w:pPr>
+              <w:spacing w:after="0"/>
+              <w:jc w:val="left"/>
+            </w:pPr>
+            <w:r>
+              <w:rPr>
+                <w:b/>
+                <w:bCs/>
+                <w:color w:val="FFFFFF"/>
+                <w:sz w:val="18"/>
+                <w:szCs w:val="18"/>
+              </w:rPr>
+              <w:t xml:space="preserve">Sport</w:t>
+            </w:r>
+          </w:p>
+        </w:tc>
+        <w:tc>
+          <w:tcPr>
+            <w:tcW w:type="dxa" w:w="2160"/>
+            <w:shd w:fill="1F3864" w:val="clear"/>
+            <w:tcMar>
+              <w:top w:type="dxa" w:w="40"/>
+              <w:left w:type="dxa" w:w="100"/>
+              <w:bottom w:type="dxa" w:w="40"/>
+              <w:right w:type="dxa" w:w="100"/>
+            </w:tcMar>
+          </w:tcPr>
+          <w:p>
+            <w:pPr>
+              <w:spacing w:after="0"/>
+              <w:jc w:val="center"/>
+            </w:pPr>
+            <w:r>
+              <w:rPr>
+                <w:b/>
+                <w:bCs/>
+                <w:color w:val="FFFFFF"/>
+                <w:sz w:val="18"/>
+                <w:szCs w:val="18"/>
+              </w:rPr>
+              <w:t xml:space="preserve">Avg. Revenue</w:t>
+            </w:r>
+          </w:p>
+        </w:tc>
+        <w:tc>
+          <w:tcPr>
+            <w:tcW w:type="dxa" w:w="2160"/>
+            <w:shd w:fill="1F3864" w:val="clear"/>
+            <w:tcMar>
+              <w:top w:type="dxa" w:w="40"/>
+              <w:left w:type="dxa" w:w="100"/>
+              <w:bottom w:type="dxa" w:w="40"/>
+              <w:right w:type="dxa" w:w="100"/>
+            </w:tcMar>
+          </w:tcPr>
+          <w:p>
+            <w:pPr>
+              <w:spacing w:after="0"/>
+              <w:jc w:val="center"/>
+            </w:pPr>
+            <w:r>
+              <w:rPr>
+                <w:b/>
+                <w:bCs/>
+                <w:color w:val="FFFFFF"/>
+                <w:sz w:val="18"/>
+                <w:szCs w:val="18"/>
+              </w:rPr>
+              <w:t xml:space="preserve">Avg. GSR</w:t>
+            </w:r>
+          </w:p>
+        </w:tc>
+        <w:tc>
+          <w:tcPr>
+            <w:tcW w:type="dxa" w:w="2160"/>
+            <w:shd w:fill="1F3864" w:val="clear"/>
+            <w:tcMar>
+              <w:top w:type="dxa" w:w="40"/>
+              <w:left w:type="dxa" w:w="100"/>
+              <w:bottom w:type="dxa" w:w="40"/>
+              <w:right w:type="dxa" w:w="100"/>
+            </w:tcMar>
+          </w:tcPr>
+          <w:p>
+            <w:pPr>
+              <w:spacing w:after="0"/>
+              <w:jc w:val="center"/>
+            </w:pPr>
+            <w:r>
+              <w:rPr>
+                <w:b/>
+                <w:bCs/>
+                <w:color w:val="FFFFFF"/>
+                <w:sz w:val="18"/>
+                <w:szCs w:val="18"/>
+              </w:rPr>
+              <w:t xml:space="preserve">Avg. Win %</w:t>
+            </w:r>
+          </w:p>
+        </w:tc>
+      </w:tr>
+      <w:tr>
+        <w:tc>
+          <w:tcPr>
+            <w:tcW w:type="dxa" w:w="2160"/>
+            <w:tcMar>
+              <w:top w:type="dxa" w:w="40"/>
+              <w:left w:type="dxa" w:w="100"/>
+              <w:bottom w:type="dxa" w:w="40"/>
+              <w:right w:type="dxa" w:w="100"/>
+            </w:tcMar>
+          </w:tcPr>
+          <w:p>
+            <w:pPr>
+              <w:spacing w:after="0"/>
+              <w:jc w:val="left"/>
+            </w:pPr>
+            <w:r>
+              <w:rPr>
+                <w:b w:val="false"/>
+                <w:bCs w:val="false"/>
+                <w:color w:val="000000"/>
+                <w:sz w:val="16"/>
+                <w:szCs w:val="16"/>
+              </w:rPr>
+              <w:t xml:space="preserve">Football</w:t>
+            </w:r>
+          </w:p>
+        </w:tc>
+        <w:tc>
+          <w:tcPr>
+            <w:tcW w:type="dxa" w:w="2160"/>
+            <w:tcMar>
+              <w:top w:type="dxa" w:w="40"/>
+              <w:left w:type="dxa" w:w="100"/>
+              <w:bottom w:type="dxa" w:w="40"/>
+              <w:right w:type="dxa" w:w="100"/>
+            </w:tcMar>
+          </w:tcPr>
+          <w:p>
+            <w:pPr>
+              <w:spacing w:after="0"/>
+              <w:jc w:val="center"/>
+            </w:pPr>
+            <w:r>
+              <w:rPr>
+                <w:b w:val="false"/>
+                <w:bCs w:val="false"/>
+                <w:color w:val="000000"/>
+                <w:sz w:val="16"/>
+                <w:szCs w:val="16"/>
+              </w:rPr>
+              <w:t xml:space="preserve">$77.2M</w:t>
+            </w:r>
+          </w:p>
+        </w:tc>
+        <w:tc>
+          <w:tcPr>
+            <w:tcW w:type="dxa" w:w="2160"/>
+            <w:tcMar>
+              <w:top w:type="dxa" w:w="40"/>
+              <w:left w:type="dxa" w:w="100"/>
+              <w:bottom w:type="dxa" w:w="40"/>
+              <w:right w:type="dxa" w:w="100"/>
+            </w:tcMar>
+          </w:tcPr>
+          <w:p>
+            <w:pPr>
+              <w:spacing w:after="0"/>
+              <w:jc w:val="center"/>
+            </w:pPr>
+            <w:r>
+              <w:rPr>
+                <w:b w:val="false"/>
+                <w:bCs w:val="false"/>
+                <w:color w:val="000000"/>
+                <w:sz w:val="16"/>
+                <w:szCs w:val="16"/>
+              </w:rPr>
+              <w:t xml:space="preserve">86</w:t>
+            </w:r>
+          </w:p>
+        </w:tc>
+        <w:tc>
+          <w:tcPr>
+            <w:tcW w:type="dxa" w:w="2160"/>
+            <w:tcMar>
+              <w:top w:type="dxa" w:w="40"/>
+              <w:left w:type="dxa" w:w="100"/>
+              <w:bottom w:type="dxa" w:w="40"/>
+              <w:right w:type="dxa" w:w="100"/>
+            </w:tcMar>
+          </w:tcPr>
+          <w:p>
+            <w:pPr>
+              <w:spacing w:after="0"/>
+              <w:jc w:val="center"/>
+            </w:pPr>
+            <w:r>
+              <w:rPr>
+                <w:b w:val="false"/>
+                <w:bCs w:val="false"/>
+                <w:color w:val="000000"/>
+                <w:sz w:val="16"/>
+                <w:szCs w:val="16"/>
+              </w:rPr>
+              <w:t xml:space="preserve">56%</w:t>
+            </w:r>
+          </w:p>
+        </w:tc>
+      </w:tr>
+      <w:tr>
+        <w:tc>
+          <w:tcPr>
+            <w:tcW w:type="dxa" w:w="2160"/>
+            <w:tcMar>
+              <w:top w:type="dxa" w:w="40"/>
+              <w:left w:type="dxa" w:w="100"/>
+              <w:bottom w:type="dxa" w:w="40"/>
+              <w:right w:type="dxa" w:w="100"/>
+            </w:tcMar>
+          </w:tcPr>
+          <w:p>
+            <w:pPr>
+              <w:spacing w:after="0"/>
+              <w:jc w:val="left"/>
+            </w:pPr>
+            <w:r>
+              <w:rPr>
+                <w:b w:val="false"/>
+                <w:bCs w:val="false"/>
+                <w:color w:val="000000"/>
+                <w:sz w:val="16"/>
+                <w:szCs w:val="16"/>
+              </w:rPr>
+              <w:t xml:space="preserve">Basketball</w:t>
+            </w:r>
+          </w:p>
+        </w:tc>
+        <w:tc>
+          <w:tcPr>
+            <w:tcW w:type="dxa" w:w="2160"/>
+            <w:tcMar>
+              <w:top w:type="dxa" w:w="40"/>
+              <w:left w:type="dxa" w:w="100"/>
+              <w:bottom w:type="dxa" w:w="40"/>
+              <w:right w:type="dxa" w:w="100"/>
+            </w:tcMar>
+          </w:tcPr>
+          <w:p>
+            <w:pPr>
+              <w:spacing w:after="0"/>
+              <w:jc w:val="center"/>
+            </w:pPr>
+            <w:r>
+              <w:rPr>
+                <w:b w:val="false"/>
+                <w:bCs w:val="false"/>
+                <w:color w:val="000000"/>
+                <w:sz w:val="16"/>
+                <w:szCs w:val="16"/>
+              </w:rPr>
+              <w:t xml:space="preserve">$22.4M</w:t>
+            </w:r>
+          </w:p>
+        </w:tc>
+        <w:tc>
+          <w:tcPr>
+            <w:tcW w:type="dxa" w:w="2160"/>
+            <w:tcMar>
+              <w:top w:type="dxa" w:w="40"/>
+              <w:left w:type="dxa" w:w="100"/>
+              <w:bottom w:type="dxa" w:w="40"/>
+              <w:right w:type="dxa" w:w="100"/>
+            </w:tcMar>
+          </w:tcPr>
+          <w:p>
+            <w:pPr>
+              <w:spacing w:after="0"/>
+              <w:jc w:val="center"/>
+            </w:pPr>
+            <w:r>
+              <w:rPr>
+                <w:b w:val="false"/>
+                <w:bCs w:val="false"/>
+                <w:color w:val="000000"/>
+                <w:sz w:val="16"/>
+                <w:szCs w:val="16"/>
+              </w:rPr>
+              <w:t xml:space="preserve">80</w:t>
+            </w:r>
+          </w:p>
+        </w:tc>
+        <w:tc>
+          <w:tcPr>
+            <w:tcW w:type="dxa" w:w="2160"/>
+            <w:tcMar>
+              <w:top w:type="dxa" w:w="40"/>
+              <w:left w:type="dxa" w:w="100"/>
+              <w:bottom w:type="dxa" w:w="40"/>
+              <w:right w:type="dxa" w:w="100"/>
+            </w:tcMar>
+          </w:tcPr>
+          <w:p>
+            <w:pPr>
+              <w:spacing w:after="0"/>
+              <w:jc w:val="center"/>
+            </w:pPr>
+            <w:r>
+              <w:rPr>
+                <w:b w:val="false"/>
+                <w:bCs w:val="false"/>
+                <w:color w:val="000000"/>
+                <w:sz w:val="16"/>
+                <w:szCs w:val="16"/>
+              </w:rPr>
+              <w:t xml:space="preserve">59%</w:t>
+            </w:r>
+          </w:p>
+        </w:tc>
+      </w:tr>
+      <w:tr>
+        <w:tc>
+          <w:tcPr>
+            <w:tcW w:type="dxa" w:w="2160"/>
+            <w:tcMar>
+              <w:top w:type="dxa" w:w="40"/>
+              <w:left w:type="dxa" w:w="100"/>
+              <w:bottom w:type="dxa" w:w="40"/>
+              <w:right w:type="dxa" w:w="100"/>
+            </w:tcMar>
+          </w:tcPr>
+          <w:p>
+            <w:pPr>
+              <w:spacing w:after="0"/>
+              <w:jc w:val="left"/>
+            </w:pPr>
+            <w:r>
+              <w:rPr>
+                <w:b w:val="false"/>
+                <w:bCs w:val="false"/>
+                <w:color w:val="000000"/>
+                <w:sz w:val="16"/>
+                <w:szCs w:val="16"/>
+              </w:rPr>
+              <w:t xml:space="preserve">Volleyball</w:t>
+            </w:r>
+          </w:p>
+        </w:tc>
+        <w:tc>
+          <w:tcPr>
+            <w:tcW w:type="dxa" w:w="2160"/>
+            <w:tcMar>
+              <w:top w:type="dxa" w:w="40"/>
+              <w:left w:type="dxa" w:w="100"/>
+              <w:bottom w:type="dxa" w:w="40"/>
+              <w:right w:type="dxa" w:w="100"/>
+            </w:tcMar>
+          </w:tcPr>
+          <w:p>
+            <w:pPr>
+              <w:spacing w:after="0"/>
+              <w:jc w:val="center"/>
+            </w:pPr>
+            <w:r>
+              <w:rPr>
+                <w:b w:val="false"/>
+                <w:bCs w:val="false"/>
+                <w:color w:val="000000"/>
+                <w:sz w:val="16"/>
+                <w:szCs w:val="16"/>
+              </w:rPr>
+              <w:t xml:space="preserve">$2.1M</w:t>
+            </w:r>
+          </w:p>
+        </w:tc>
+        <w:tc>
+          <w:tcPr>
+            <w:tcW w:type="dxa" w:w="2160"/>
+            <w:tcMar>
+              <w:top w:type="dxa" w:w="40"/>
+              <w:left w:type="dxa" w:w="100"/>
+              <w:bottom w:type="dxa" w:w="40"/>
+              <w:right w:type="dxa" w:w="100"/>
+            </w:tcMar>
+          </w:tcPr>
+          <w:p>
+            <w:pPr>
+              <w:spacing w:after="0"/>
+              <w:jc w:val="center"/>
+            </w:pPr>
+            <w:r>
+              <w:rPr>
+                <w:b w:val="false"/>
+                <w:bCs w:val="false"/>
+                <w:color w:val="000000"/>
+                <w:sz w:val="16"/>
+                <w:szCs w:val="16"/>
+              </w:rPr>
+              <w:t xml:space="preserve">97</w:t>
+            </w:r>
+          </w:p>
+        </w:tc>
+        <w:tc>
+          <w:tcPr>
+            <w:tcW w:type="dxa" w:w="2160"/>
+            <w:tcMar>
+              <w:top w:type="dxa" w:w="40"/>
+              <w:left w:type="dxa" w:w="100"/>
+              <w:bottom w:type="dxa" w:w="40"/>
+              <w:right w:type="dxa" w:w="100"/>
+            </w:tcMar>
+          </w:tcPr>
+          <w:p>
+            <w:pPr>
+              <w:spacing w:after="0"/>
+              <w:jc w:val="center"/>
+            </w:pPr>
+            <w:r>
+              <w:rPr>
+                <w:b w:val="false"/>
+                <w:bCs w:val="false"/>
+                <w:color w:val="000000"/>
+                <w:sz w:val="16"/>
+                <w:szCs w:val="16"/>
+              </w:rPr>
+              <w:t xml:space="preserve">58%</w:t>
+            </w:r>
+          </w:p>
+        </w:tc>
+      </w:tr>
+      <w:tr>
+        <w:tc>
+          <w:tcPr>
+            <w:tcW w:type="dxa" w:w="2160"/>
+            <w:tcMar>
+              <w:top w:type="dxa" w:w="40"/>
+              <w:left w:type="dxa" w:w="100"/>
+              <w:bottom w:type="dxa" w:w="40"/>
+              <w:right w:type="dxa" w:w="100"/>
+            </w:tcMar>
+          </w:tcPr>
+          <w:p>
+            <w:pPr>
+              <w:spacing w:after="0"/>
+              <w:jc w:val="left"/>
+            </w:pPr>
+            <w:r>
+              <w:rPr>
+                <w:b w:val="false"/>
+                <w:bCs w:val="false"/>
+                <w:color w:val="000000"/>
+                <w:sz w:val="16"/>
+                <w:szCs w:val="16"/>
+              </w:rPr>
+              <w:t xml:space="preserve">Soccer (equalizer)</w:t>
+            </w:r>
+          </w:p>
+        </w:tc>
+        <w:tc>
+          <w:tcPr>
+            <w:tcW w:type="dxa" w:w="2160"/>
+            <w:tcMar>
+              <w:top w:type="dxa" w:w="40"/>
+              <w:left w:type="dxa" w:w="100"/>
+              <w:bottom w:type="dxa" w:w="40"/>
+              <w:right w:type="dxa" w:w="100"/>
+            </w:tcMar>
+          </w:tcPr>
+          <w:p>
+            <w:pPr>
+              <w:spacing w:after="0"/>
+              <w:jc w:val="center"/>
+            </w:pPr>
+            <w:r>
+              <w:rPr>
+                <w:b w:val="false"/>
+                <w:bCs w:val="false"/>
+                <w:color w:val="000000"/>
+                <w:sz w:val="16"/>
+                <w:szCs w:val="16"/>
+              </w:rPr>
+              <w:t xml:space="preserve">$3.1M</w:t>
+            </w:r>
+          </w:p>
+        </w:tc>
+        <w:tc>
+          <w:tcPr>
+            <w:tcW w:type="dxa" w:w="2160"/>
+            <w:tcMar>
+              <w:top w:type="dxa" w:w="40"/>
+              <w:left w:type="dxa" w:w="100"/>
+              <w:bottom w:type="dxa" w:w="40"/>
+              <w:right w:type="dxa" w:w="100"/>
+            </w:tcMar>
+          </w:tcPr>
+          <w:p>
+            <w:pPr>
+              <w:spacing w:after="0"/>
+              <w:jc w:val="center"/>
+            </w:pPr>
+            <w:r>
+              <w:rPr>
+                <w:b w:val="false"/>
+                <w:bCs w:val="false"/>
+                <w:color w:val="000000"/>
+                <w:sz w:val="16"/>
+                <w:szCs w:val="16"/>
+              </w:rPr>
+              <w:t xml:space="preserve">94</w:t>
+            </w:r>
+          </w:p>
+        </w:tc>
+        <w:tc>
+          <w:tcPr>
+            <w:tcW w:type="dxa" w:w="2160"/>
+            <w:tcMar>
+              <w:top w:type="dxa" w:w="40"/>
+              <w:left w:type="dxa" w:w="100"/>
+              <w:bottom w:type="dxa" w:w="40"/>
+              <w:right w:type="dxa" w:w="100"/>
+            </w:tcMar>
+          </w:tcPr>
+          <w:p>
+            <w:pPr>
+              <w:spacing w:after="0"/>
+              <w:jc w:val="center"/>
+            </w:pPr>
+            <w:r>
+              <w:rPr>
+                <w:b w:val="false"/>
+                <w:bCs w:val="false"/>
+                <w:color w:val="000000"/>
+                <w:sz w:val="16"/>
+                <w:szCs w:val="16"/>
+              </w:rPr>
+              <w:t xml:space="preserve">36%</w:t>
+            </w:r>
+          </w:p>
+        </w:tc>
+      </w:tr>
+    </w:tbl>
+    <w:p>
+      <w:pPr>
+        <w:spacing w:after="40"/>
+      </w:pPr>
+      <w:r>
+        <w:br/>
+        <w:t xml:space="preserve"/>
+      </w:r>
+    </w:p>
+    <w:p>
+      <w:pPr>
         <w:pStyle w:val="Heading1"/>
         <w:pBdr>
           <w:bottom w:val="single" w:color="1F3864" w:sz="6" w:space="4"/>
@@ -902,6 +1693,52 @@
     </w:p>
     <w:p>
       <w:pPr>
+        <w:spacing w:after="120" w:before="80"/>
+        <w:jc w:val="center"/>
+      </w:pPr>
+      <w:r>
+        <w:drawing>
+          <wp:inline distT="0" distB="0" distL="0" distR="0">
+            <wp:extent cx="6096000" cy="3619500"/>
+            <wp:effectExtent t="0" r="0" b="0" l="0"/>
+            <wp:docPr id="1" name="" descr="" title=""/>
+            <wp:cNvGraphicFramePr>
+              <a:graphicFrameLocks xmlns:a="http://schemas.openxmlformats.org/drawingml/2006/main" noChangeAspect="1"/>
+            </wp:cNvGraphicFramePr>
+            <a:graphic xmlns:a="http://schemas.openxmlformats.org/drawingml/2006/main">
+              <a:graphicData uri="http://schemas.openxmlformats.org/drawingml/2006/picture">
+                <pic:pic xmlns:pic="http://schemas.openxmlformats.org/drawingml/2006/picture">
+                  <pic:nvPicPr>
+                    <pic:cNvPr id="0" name="" descr=""/>
+                    <pic:cNvPicPr>
+                      <a:picLocks noChangeAspect="1" noChangeArrowheads="1"/>
+                    </pic:cNvPicPr>
+                  </pic:nvPicPr>
+                  <pic:blipFill>
+                    <a:blip r:embed="rId7" cstate="none"/>
+                    <a:srcRect/>
+                    <a:stretch>
+                      <a:fillRect/>
+                    </a:stretch>
+                  </pic:blipFill>
+                  <pic:spPr bwMode="auto">
+                    <a:xfrm>
+                      <a:off x="0" y="0"/>
+                      <a:ext cx="6096000" cy="3619500"/>
+                    </a:xfrm>
+                    <a:prstGeom prst="rect">
+                      <a:avLst/>
+                    </a:prstGeom>
+                  </pic:spPr>
+                </pic:pic>
+              </a:graphicData>
+            </a:graphic>
+          </wp:inline>
+        </w:drawing>
+      </w:r>
+    </w:p>
+    <w:p>
+      <w:pPr>
         <w:pStyle w:val="ListParagraph"/>
         <w:numPr>
           <w:ilvl w:val="0"/>
@@ -923,7 +1760,53 @@
           <w:sz w:val="20"/>
           <w:szCs w:val="20"/>
         </w:rPr>
-        <w:t xml:space="preserve">Basketball (p &lt; 0.001) and volleyball (p = 0.005) both show real, significant revenue-to-wins relationships. Football's is only marginal (p = 0.075); soccer shows none (small sample).</w:t>
+        <w:t xml:space="preserve">Basketball (p &lt; 0.001) and volleyball (p = 0.005) both show real, significant revenue-to-wins relationships. Football's is only marginal (p = 0.071); soccer shows none (small sample).</w:t>
+      </w:r>
+    </w:p>
+    <w:p>
+      <w:pPr>
+        <w:spacing w:after="120" w:before="80"/>
+        <w:jc w:val="center"/>
+      </w:pPr>
+      <w:r>
+        <w:drawing>
+          <wp:inline distT="0" distB="0" distL="0" distR="0">
+            <wp:extent cx="6096000" cy="2857500"/>
+            <wp:effectExtent t="0" r="0" b="0" l="0"/>
+            <wp:docPr id="1" name="" descr="" title=""/>
+            <wp:cNvGraphicFramePr>
+              <a:graphicFrameLocks xmlns:a="http://schemas.openxmlformats.org/drawingml/2006/main" noChangeAspect="1"/>
+            </wp:cNvGraphicFramePr>
+            <a:graphic xmlns:a="http://schemas.openxmlformats.org/drawingml/2006/main">
+              <a:graphicData uri="http://schemas.openxmlformats.org/drawingml/2006/picture">
+                <pic:pic xmlns:pic="http://schemas.openxmlformats.org/drawingml/2006/picture">
+                  <pic:nvPicPr>
+                    <pic:cNvPr id="0" name="" descr=""/>
+                    <pic:cNvPicPr>
+                      <a:picLocks noChangeAspect="1" noChangeArrowheads="1"/>
+                    </pic:cNvPicPr>
+                  </pic:nvPicPr>
+                  <pic:blipFill>
+                    <a:blip r:embed="rId8" cstate="none"/>
+                    <a:srcRect/>
+                    <a:stretch>
+                      <a:fillRect/>
+                    </a:stretch>
+                  </pic:blipFill>
+                  <pic:spPr bwMode="auto">
+                    <a:xfrm>
+                      <a:off x="0" y="0"/>
+                      <a:ext cx="6096000" cy="2857500"/>
+                    </a:xfrm>
+                    <a:prstGeom prst="rect">
+                      <a:avLst/>
+                    </a:prstGeom>
+                  </pic:spPr>
+                </pic:pic>
+              </a:graphicData>
+            </a:graphic>
+          </wp:inline>
+        </w:drawing>
       </w:r>
     </w:p>
     <w:p>

</xml_diff>